<commit_message>
Fix imports for Railway deployment
</commit_message>
<xml_diff>
--- a/istalacion.docx
+++ b/istalacion.docx
@@ -1104,7 +1104,23 @@
           <w:bdr w:val="single" w:sz="2" w:space="1" w:color="000000"/>
           <w:lang w:val="es-ES"/>
         </w:rPr>
-        <w:t>VentaArriendo</w:t>
+        <w:t>V</w:t>
+      </w:r>
+      <w:r>
+        <w:rPr>
+          <w:rFonts w:eastAsia="Times New Roman" w:cs="Times New Roman" w:ascii="Arial;Helvetica;sans-serif" w:hAnsi="Arial;Helvetica;sans-serif"/>
+          <w:b w:val="false"/>
+          <w:i w:val="false"/>
+          <w:caps w:val="false"/>
+          <w:smallCaps w:val="false"/>
+          <w:color w:val="auto"/>
+          <w:spacing w:val="0"/>
+          <w:sz w:val="28"/>
+          <w:szCs w:val="24"/>
+          <w:bdr w:val="single" w:sz="2" w:space="1" w:color="000000"/>
+          <w:lang w:val="es-ES" w:eastAsia="en-US" w:bidi="ar-SA"/>
+        </w:rPr>
+        <w:t>enta Arriendo</w:t>
       </w:r>
     </w:p>
     <w:p>
@@ -1114,7 +1130,7 @@
         <w:spacing w:before="0" w:after="0"/>
         <w:ind w:hanging="0" w:left="0" w:right="0"/>
         <w:rPr>
-          <w:lang w:val="es-ES"/>
+          <w:lang w:val="es-ES" w:eastAsia="en-US" w:bidi="ar-SA"/>
         </w:rPr>
       </w:pPr>
       <w:r>
@@ -1128,9 +1144,9 @@
           <w:spacing w:val="0"/>
           <w:sz w:val="28"/>
           <w:bdr w:val="single" w:sz="2" w:space="1" w:color="000000"/>
-          <w:lang w:val="es-ES"/>
-        </w:rPr>
-        <w:t>TodosApartamentoCasaLoteOficinaLocal</w:t>
+          <w:lang w:val="es-ES" w:eastAsia="en-US" w:bidi="ar-SA"/>
+        </w:rPr>
+        <w:t>Todos ApartamentoCasaLoteOficinaLocal</w:t>
       </w:r>
     </w:p>
     <w:p>
@@ -1140,7 +1156,7 @@
         <w:spacing w:before="0" w:after="0"/>
         <w:ind w:hanging="0" w:left="0" w:right="0"/>
         <w:rPr>
-          <w:lang w:val="es-ES"/>
+          <w:lang w:val="es-ES" w:eastAsia="en-US" w:bidi="ar-SA"/>
         </w:rPr>
       </w:pPr>
       <w:r>
@@ -1154,7 +1170,7 @@
           <w:spacing w:val="0"/>
           <w:sz w:val="28"/>
           <w:bdr w:val="single" w:sz="2" w:space="1" w:color="000000"/>
-          <w:lang w:val="es-ES"/>
+          <w:lang w:val="es-ES" w:eastAsia="en-US" w:bidi="ar-SA"/>
         </w:rPr>
         <w:t>Todas12345</w:t>
       </w:r>
@@ -2048,9 +2064,7 @@
         </w:rPr>
       </w:pPr>
       <w:r>
-        <w:rPr>
-          <w:lang w:val="es-ES"/>
-        </w:rPr>
+        <w:rPr/>
         <w:drawing>
           <wp:inline distT="0" distB="0" distL="0" distR="0">
             <wp:extent cx="114300" cy="114300"/>
@@ -3480,6 +3494,7 @@
       </w:pPr>
       <w:r>
         <w:rPr>
+          <w:color w:val="auto"/>
           <w:lang w:val="es-ES"/>
         </w:rPr>
       </w:r>
@@ -3945,6 +3960,19 @@
         <w:pStyle w:val="BodyText"/>
         <w:spacing w:before="0" w:after="0"/>
         <w:ind w:hanging="0" w:left="0" w:right="0"/>
+        <w:rPr>
+          <w:rFonts w:ascii="system-ui;Ubuntu;Droid Sans;sans-serif" w:hAnsi="system-ui;Ubuntu;Droid Sans;sans-serif"/>
+          <w:b w:val="false"/>
+          <w:i w:val="false"/>
+          <w:i w:val="false"/>
+          <w:caps w:val="false"/>
+          <w:smallCaps w:val="false"/>
+          <w:color w:val="auto"/>
+          <w:spacing w:val="0"/>
+          <w:sz w:val="20"/>
+        </w:rPr>
+      </w:pPr>
+      <w:r>
         <w:rPr>
           <w:rFonts w:ascii="system-ui;Ubuntu;Droid Sans;sans-serif" w:hAnsi="system-ui;Ubuntu;Droid Sans;sans-serif"/>
           <w:b w:val="false"/>
@@ -3955,18 +3983,6 @@
           <w:spacing w:val="0"/>
           <w:sz w:val="20"/>
         </w:rPr>
-      </w:pPr>
-      <w:r>
-        <w:rPr>
-          <w:rFonts w:ascii="system-ui;Ubuntu;Droid Sans;sans-serif" w:hAnsi="system-ui;Ubuntu;Droid Sans;sans-serif"/>
-          <w:b w:val="false"/>
-          <w:i w:val="false"/>
-          <w:caps w:val="false"/>
-          <w:smallCaps w:val="false"/>
-          <w:color w:val="auto"/>
-          <w:spacing w:val="0"/>
-          <w:sz w:val="20"/>
-        </w:rPr>
         <w:t>La ventaja sobre el scheduler de Python es que cron es parte del sistema operativo — no necesitas nada corriendo, el sistema lo activa solo a la hora programada.</w:t>
       </w:r>
     </w:p>
@@ -3998,13 +4014,7 @@
         <w:rPr>
           <w:lang w:val="es-ES"/>
         </w:rPr>
-        <w:t>---</w:t>
-      </w:r>
-      <w:r>
-        <w:rPr>
-          <w:lang w:val="es-ES"/>
-        </w:rPr>
-        <w:t>&amp;----</w:t>
+        <w:t>---&amp;----</w:t>
       </w:r>
     </w:p>
     <w:p>
@@ -4034,6 +4044,7 @@
       </w:pPr>
       <w:r>
         <w:rPr>
+          <w:color w:val="auto"/>
           <w:lang w:val="es-ES"/>
         </w:rPr>
       </w:r>

</xml_diff>